<commit_message>
Add R2 video embeds and domain notes
</commit_message>
<xml_diff>
--- a/Media_Contribution_Manual_Admin.docx
+++ b/Media_Contribution_Manual_Admin.docx
@@ -1,6 +1,6 @@
 
 <file path=word/document.xml><?xml version="1.0" encoding="utf-8"?>
-<w:document xmlns:wpc="http://schemas.microsoft.com/office/word/2010/wordprocessingCanvas" xmlns:mc="http://schemas.openxmlformats.org/markup-compatibility/2006" xmlns:o="urn:schemas-microsoft-com:office:office" xmlns:r="http://schemas.openxmlformats.org/officeDocument/2006/relationships" xmlns:m="http://schemas.openxmlformats.org/officeDocument/2006/math" xmlns:v="urn:schemas-microsoft-com:vml" xmlns:wp14="http://schemas.microsoft.com/office/word/2010/wordprocessingDrawing" xmlns:wp="http://schemas.openxmlformats.org/drawingml/2006/wordprocessingDrawing" xmlns:w10="urn:schemas-microsoft-com:office:word" xmlns:w="http://schemas.openxmlformats.org/wordprocessingml/2006/main" xmlns:w14="http://schemas.microsoft.com/office/word/2010/wordml" xmlns:w15="http://schemas.microsoft.com/office/word/2012/wordml" xmlns:wpg="http://schemas.microsoft.com/office/word/2010/wordprocessingGroup" xmlns:wpi="http://schemas.microsoft.com/office/word/2010/wordprocessingInk" xmlns:wne="http://schemas.microsoft.com/office/word/2006/wordml" xmlns:wps="http://schemas.microsoft.com/office/word/2010/wordprocessingShape" xmlns:cx="http://schemas.microsoft.com/office/drawing/2014/chartex" xmlns:cx1="http://schemas.microsoft.com/office/drawing/2015/9/8/chartex" xmlns:cx2="http://schemas.microsoft.com/office/drawing/2015/10/21/chartex" xmlns:cx3="http://schemas.microsoft.com/office/drawing/2016/5/9/chartex" xmlns:cx4="http://schemas.microsoft.com/office/drawing/2016/5/10/chartex" xmlns:cx5="http://schemas.microsoft.com/office/drawing/2016/5/11/chartex" xmlns:cx6="http://schemas.microsoft.com/office/drawing/2016/5/12/chartex" xmlns:cx7="http://schemas.microsoft.com/office/drawing/2016/5/13/chartex" xmlns:cx8="http://schemas.microsoft.com/office/drawing/2016/5/14/chartex" xmlns:aink="http://schemas.microsoft.com/office/drawing/2016/ink" xmlns:am3d="http://schemas.microsoft.com/office/drawing/2017/model3d" xmlns:w16cex="http://schemas.microsoft.com/office/word/2018/wordml/cex" xmlns:w16cid="http://schemas.microsoft.com/office/word/2016/wordml/cid" xmlns:w16="http://schemas.microsoft.com/office/word/2018/wordml" xmlns:w16sdtdh="http://schemas.microsoft.com/office/word/2020/wordml/sdtdatahash" xmlns:w16se="http://schemas.microsoft.com/office/word/2015/wordml/symex" mc:Ignorable="w14 w15 wp14">
+<w:document xmlns:ns1="http://schemas.openxmlformats.org/markup-compatibility/2006" xmlns:ns2="http://schemas.openxmlformats.org/officeDocument/2006/relationships" xmlns:ns3="http://schemas.openxmlformats.org/drawingml/2006/wordprocessingDrawing" xmlns:ns4="http://schemas.openxmlformats.org/drawingml/2006/main" xmlns:ns5="http://schemas.openxmlformats.org/drawingml/2006/picture" xmlns:w="http://schemas.openxmlformats.org/wordprocessingml/2006/main" ns1:Ignorable="w14 w15 wp14">
   <w:body>
     <w:p>
       <w:pPr>
@@ -53,9 +53,9 @@
           <w:sz w:val="20"/>
           <w:szCs w:val="20"/>
         </w:rPr>
-        <w:t xml:space="preserve">Website: </w:t>
-      </w:r>
-      <w:hyperlink w:history="1" r:id="rIdzpsvl6ykwqngk3thhebp-">
+        <w:t xml:space="preserve">Website (testing only): https://capstonecrac-github-io.pages.dev/</w:t>
+      </w:r>
+      <w:hyperlink w:history="1" ns2:id="rIdzpsvl6ykwqngk3thhebp-">
         <w:r>
           <w:rPr>
             <w:color w:val="1D4ED8"/>
@@ -63,7 +63,31 @@
             <w:szCs w:val="22"/>
             <w:u w:val="single" w:color="1D4ED8"/>
           </w:rPr>
-          <w:t xml:space="preserve">https://capstonecrac-github-io.pages.dev/</w:t>
+          <w:t xml:space="preserve"/>
+        </w:r>
+      </w:hyperlink>
+    </w:p>
+    <w:p>
+      <w:pPr>
+        <w:spacing w:after="40"/>
+      </w:pPr>
+      <w:r>
+        <w:rPr>
+          <w:color w:val="6B7280"/>
+          <w:sz w:val="20"/>
+          <w:szCs w:val="20"/>
+        </w:rPr>
+        <w:t xml:space="preserve">Production domain support needed: capstonecrac.edu.hk for the main site, and media.capstonecrac.edu.hk for the video bucket.</w:t>
+      </w:r>
+      <w:hyperlink w:history="1" ns2:id="rIdzpsvl6ykwqngk3thhebp-">
+        <w:r>
+          <w:rPr>
+            <w:color w:val="1D4ED8"/>
+            <w:sz w:val="22"/>
+            <w:szCs w:val="22"/>
+            <w:u w:val="single" w:color="1D4ED8"/>
+          </w:rPr>
+          <w:t xml:space="preserve"/>
         </w:r>
       </w:hyperlink>
     </w:p>
@@ -1413,42 +1437,42 @@
       </w:pPr>
       <w:r>
         <w:drawing>
-          <wp:inline distT="0" distB="0" distL="0" distR="0">
-            <wp:extent cx="5715000" cy="3419475"/>
-            <wp:effectExtent t="0" r="0" b="0" l="0"/>
-            <wp:docPr id="1" name="" descr="" title=""/>
-            <wp:cNvGraphicFramePr>
-              <a:graphicFrameLocks xmlns:a="http://schemas.openxmlformats.org/drawingml/2006/main" noChangeAspect="1"/>
-            </wp:cNvGraphicFramePr>
-            <a:graphic xmlns:a="http://schemas.openxmlformats.org/drawingml/2006/main">
-              <a:graphicData uri="http://schemas.openxmlformats.org/drawingml/2006/picture">
-                <pic:pic xmlns:pic="http://schemas.openxmlformats.org/drawingml/2006/picture">
-                  <pic:nvPicPr>
-                    <pic:cNvPr id="0" name="" descr=""/>
-                    <pic:cNvPicPr>
-                      <a:picLocks noChangeAspect="1" noChangeArrowheads="1"/>
-                    </pic:cNvPicPr>
-                  </pic:nvPicPr>
-                  <pic:blipFill>
-                    <a:blip r:embed="rId8" cstate="none"/>
-                    <a:srcRect/>
-                    <a:stretch>
-                      <a:fillRect/>
-                    </a:stretch>
-                  </pic:blipFill>
-                  <pic:spPr bwMode="auto">
-                    <a:xfrm>
-                      <a:off x="0" y="0"/>
-                      <a:ext cx="5715000" cy="3419475"/>
-                    </a:xfrm>
-                    <a:prstGeom prst="rect">
-                      <a:avLst/>
-                    </a:prstGeom>
-                  </pic:spPr>
-                </pic:pic>
-              </a:graphicData>
-            </a:graphic>
-          </wp:inline>
+          <ns3:inline distT="0" distB="0" distL="0" distR="0">
+            <ns3:extent cx="5715000" cy="3419475"/>
+            <ns3:effectExtent t="0" r="0" b="0" l="0"/>
+            <ns3:docPr id="1" name="" descr="" title=""/>
+            <ns3:cNvGraphicFramePr>
+              <ns4:graphicFrameLocks noChangeAspect="1"/>
+            </ns3:cNvGraphicFramePr>
+            <ns4:graphic>
+              <ns4:graphicData uri="http://schemas.openxmlformats.org/drawingml/2006/picture">
+                <ns5:pic>
+                  <ns5:nvPicPr>
+                    <ns5:cNvPr id="0" name="" descr=""/>
+                    <ns5:cNvPicPr>
+                      <ns4:picLocks noChangeAspect="1" noChangeArrowheads="1"/>
+                    </ns5:cNvPicPr>
+                  </ns5:nvPicPr>
+                  <ns5:blipFill>
+                    <ns4:blip ns2:embed="rId8" cstate="none"/>
+                    <ns4:srcRect/>
+                    <ns4:stretch>
+                      <ns4:fillRect/>
+                    </ns4:stretch>
+                  </ns5:blipFill>
+                  <ns5:spPr bwMode="auto">
+                    <ns4:xfrm>
+                      <ns4:off x="0" y="0"/>
+                      <ns4:ext cx="5715000" cy="3419475"/>
+                    </ns4:xfrm>
+                    <ns4:prstGeom prst="rect">
+                      <ns4:avLst/>
+                    </ns4:prstGeom>
+                  </ns5:spPr>
+                </ns5:pic>
+              </ns4:graphicData>
+            </ns4:graphic>
+          </ns3:inline>
         </w:drawing>
       </w:r>
     </w:p>
@@ -2387,42 +2411,42 @@
       </w:pPr>
       <w:r>
         <w:drawing>
-          <wp:inline distT="0" distB="0" distL="0" distR="0">
-            <wp:extent cx="5715000" cy="3419475"/>
-            <wp:effectExtent t="0" r="0" b="0" l="0"/>
-            <wp:docPr id="1" name="" descr="" title=""/>
-            <wp:cNvGraphicFramePr>
-              <a:graphicFrameLocks xmlns:a="http://schemas.openxmlformats.org/drawingml/2006/main" noChangeAspect="1"/>
-            </wp:cNvGraphicFramePr>
-            <a:graphic xmlns:a="http://schemas.openxmlformats.org/drawingml/2006/main">
-              <a:graphicData uri="http://schemas.openxmlformats.org/drawingml/2006/picture">
-                <pic:pic xmlns:pic="http://schemas.openxmlformats.org/drawingml/2006/picture">
-                  <pic:nvPicPr>
-                    <pic:cNvPr id="0" name="" descr=""/>
-                    <pic:cNvPicPr>
-                      <a:picLocks noChangeAspect="1" noChangeArrowheads="1"/>
-                    </pic:cNvPicPr>
-                  </pic:nvPicPr>
-                  <pic:blipFill>
-                    <a:blip r:embed="rId9" cstate="none"/>
-                    <a:srcRect/>
-                    <a:stretch>
-                      <a:fillRect/>
-                    </a:stretch>
-                  </pic:blipFill>
-                  <pic:spPr bwMode="auto">
-                    <a:xfrm>
-                      <a:off x="0" y="0"/>
-                      <a:ext cx="5715000" cy="3419475"/>
-                    </a:xfrm>
-                    <a:prstGeom prst="rect">
-                      <a:avLst/>
-                    </a:prstGeom>
-                  </pic:spPr>
-                </pic:pic>
-              </a:graphicData>
-            </a:graphic>
-          </wp:inline>
+          <ns3:inline distT="0" distB="0" distL="0" distR="0">
+            <ns3:extent cx="5715000" cy="3419475"/>
+            <ns3:effectExtent t="0" r="0" b="0" l="0"/>
+            <ns3:docPr id="1" name="" descr="" title=""/>
+            <ns3:cNvGraphicFramePr>
+              <ns4:graphicFrameLocks noChangeAspect="1"/>
+            </ns3:cNvGraphicFramePr>
+            <ns4:graphic>
+              <ns4:graphicData uri="http://schemas.openxmlformats.org/drawingml/2006/picture">
+                <ns5:pic>
+                  <ns5:nvPicPr>
+                    <ns5:cNvPr id="0" name="" descr=""/>
+                    <ns5:cNvPicPr>
+                      <ns4:picLocks noChangeAspect="1" noChangeArrowheads="1"/>
+                    </ns5:cNvPicPr>
+                  </ns5:nvPicPr>
+                  <ns5:blipFill>
+                    <ns4:blip ns2:embed="rId9" cstate="none"/>
+                    <ns4:srcRect/>
+                    <ns4:stretch>
+                      <ns4:fillRect/>
+                    </ns4:stretch>
+                  </ns5:blipFill>
+                  <ns5:spPr bwMode="auto">
+                    <ns4:xfrm>
+                      <ns4:off x="0" y="0"/>
+                      <ns4:ext cx="5715000" cy="3419475"/>
+                    </ns4:xfrm>
+                    <ns4:prstGeom prst="rect">
+                      <ns4:avLst/>
+                    </ns4:prstGeom>
+                  </ns5:spPr>
+                </ns5:pic>
+              </ns4:graphicData>
+            </ns4:graphic>
+          </ns3:inline>
         </w:drawing>
       </w:r>
     </w:p>
@@ -3897,7 +3921,7 @@
                 <w:sz w:val="21"/>
                 <w:szCs w:val="21"/>
               </w:rPr>
-              <w:t xml:space="preserve">Video files are too large for the GitHub repository. Every project video goes to Cloudflare R2 instead. Only the copied video link (URL) is placed in the Markdown.</w:t>
+              <w:t xml:space="preserve">Video files are too large for the GitHub repository. Every project video goes to Cloudflare R2 instead. Only the copied video link (URL) is placed in the Markdown. Cloudflare R2 includes only 10 GB of free storage, so upload a compressed web MP4 rather than a raw export.</w:t>
             </w:r>
           </w:p>
         </w:tc>
@@ -3916,42 +3940,42 @@
       </w:pPr>
       <w:r>
         <w:drawing>
-          <wp:inline distT="0" distB="0" distL="0" distR="0">
-            <wp:extent cx="5715000" cy="3667125"/>
-            <wp:effectExtent t="0" r="0" b="0" l="0"/>
-            <wp:docPr id="1" name="" descr="" title=""/>
-            <wp:cNvGraphicFramePr>
-              <a:graphicFrameLocks xmlns:a="http://schemas.openxmlformats.org/drawingml/2006/main" noChangeAspect="1"/>
-            </wp:cNvGraphicFramePr>
-            <a:graphic xmlns:a="http://schemas.openxmlformats.org/drawingml/2006/main">
-              <a:graphicData uri="http://schemas.openxmlformats.org/drawingml/2006/picture">
-                <pic:pic xmlns:pic="http://schemas.openxmlformats.org/drawingml/2006/picture">
-                  <pic:nvPicPr>
-                    <pic:cNvPr id="0" name="" descr=""/>
-                    <pic:cNvPicPr>
-                      <a:picLocks noChangeAspect="1" noChangeArrowheads="1"/>
-                    </pic:cNvPicPr>
-                  </pic:nvPicPr>
-                  <pic:blipFill>
-                    <a:blip r:embed="rId10" cstate="none"/>
-                    <a:srcRect/>
-                    <a:stretch>
-                      <a:fillRect/>
-                    </a:stretch>
-                  </pic:blipFill>
-                  <pic:spPr bwMode="auto">
-                    <a:xfrm>
-                      <a:off x="0" y="0"/>
-                      <a:ext cx="5715000" cy="3667125"/>
-                    </a:xfrm>
-                    <a:prstGeom prst="rect">
-                      <a:avLst/>
-                    </a:prstGeom>
-                  </pic:spPr>
-                </pic:pic>
-              </a:graphicData>
-            </a:graphic>
-          </wp:inline>
+          <ns3:inline distT="0" distB="0" distL="0" distR="0">
+            <ns3:extent cx="5715000" cy="3667125"/>
+            <ns3:effectExtent t="0" r="0" b="0" l="0"/>
+            <ns3:docPr id="1" name="" descr="" title=""/>
+            <ns3:cNvGraphicFramePr>
+              <ns4:graphicFrameLocks noChangeAspect="1"/>
+            </ns3:cNvGraphicFramePr>
+            <ns4:graphic>
+              <ns4:graphicData uri="http://schemas.openxmlformats.org/drawingml/2006/picture">
+                <ns5:pic>
+                  <ns5:nvPicPr>
+                    <ns5:cNvPr id="0" name="" descr=""/>
+                    <ns5:cNvPicPr>
+                      <ns4:picLocks noChangeAspect="1" noChangeArrowheads="1"/>
+                    </ns5:cNvPicPr>
+                  </ns5:nvPicPr>
+                  <ns5:blipFill>
+                    <ns4:blip ns2:embed="rId10" cstate="none"/>
+                    <ns4:srcRect/>
+                    <ns4:stretch>
+                      <ns4:fillRect/>
+                    </ns4:stretch>
+                  </ns5:blipFill>
+                  <ns5:spPr bwMode="auto">
+                    <ns4:xfrm>
+                      <ns4:off x="0" y="0"/>
+                      <ns4:ext cx="5715000" cy="3667125"/>
+                    </ns4:xfrm>
+                    <ns4:prstGeom prst="rect">
+                      <ns4:avLst/>
+                    </ns4:prstGeom>
+                  </ns5:spPr>
+                </ns5:pic>
+              </ns4:graphicData>
+            </ns4:graphic>
+          </ns3:inline>
         </w:drawing>
       </w:r>
     </w:p>
@@ -4009,42 +4033,42 @@
       </w:pPr>
       <w:r>
         <w:drawing>
-          <wp:inline distT="0" distB="0" distL="0" distR="0">
-            <wp:extent cx="5715000" cy="3667125"/>
-            <wp:effectExtent t="0" r="0" b="0" l="0"/>
-            <wp:docPr id="1" name="" descr="" title=""/>
-            <wp:cNvGraphicFramePr>
-              <a:graphicFrameLocks xmlns:a="http://schemas.openxmlformats.org/drawingml/2006/main" noChangeAspect="1"/>
-            </wp:cNvGraphicFramePr>
-            <a:graphic xmlns:a="http://schemas.openxmlformats.org/drawingml/2006/main">
-              <a:graphicData uri="http://schemas.openxmlformats.org/drawingml/2006/picture">
-                <pic:pic xmlns:pic="http://schemas.openxmlformats.org/drawingml/2006/picture">
-                  <pic:nvPicPr>
-                    <pic:cNvPr id="0" name="" descr=""/>
-                    <pic:cNvPicPr>
-                      <a:picLocks noChangeAspect="1" noChangeArrowheads="1"/>
-                    </pic:cNvPicPr>
-                  </pic:nvPicPr>
-                  <pic:blipFill>
-                    <a:blip r:embed="rId11" cstate="none"/>
-                    <a:srcRect/>
-                    <a:stretch>
-                      <a:fillRect/>
-                    </a:stretch>
-                  </pic:blipFill>
-                  <pic:spPr bwMode="auto">
-                    <a:xfrm>
-                      <a:off x="0" y="0"/>
-                      <a:ext cx="5715000" cy="3667125"/>
-                    </a:xfrm>
-                    <a:prstGeom prst="rect">
-                      <a:avLst/>
-                    </a:prstGeom>
-                  </pic:spPr>
-                </pic:pic>
-              </a:graphicData>
-            </a:graphic>
-          </wp:inline>
+          <ns3:inline distT="0" distB="0" distL="0" distR="0">
+            <ns3:extent cx="5715000" cy="3667125"/>
+            <ns3:effectExtent t="0" r="0" b="0" l="0"/>
+            <ns3:docPr id="1" name="" descr="" title=""/>
+            <ns3:cNvGraphicFramePr>
+              <ns4:graphicFrameLocks noChangeAspect="1"/>
+            </ns3:cNvGraphicFramePr>
+            <ns4:graphic>
+              <ns4:graphicData uri="http://schemas.openxmlformats.org/drawingml/2006/picture">
+                <ns5:pic>
+                  <ns5:nvPicPr>
+                    <ns5:cNvPr id="0" name="" descr=""/>
+                    <ns5:cNvPicPr>
+                      <ns4:picLocks noChangeAspect="1" noChangeArrowheads="1"/>
+                    </ns5:cNvPicPr>
+                  </ns5:nvPicPr>
+                  <ns5:blipFill>
+                    <ns4:blip ns2:embed="rId11" cstate="none"/>
+                    <ns4:srcRect/>
+                    <ns4:stretch>
+                      <ns4:fillRect/>
+                    </ns4:stretch>
+                  </ns5:blipFill>
+                  <ns5:spPr bwMode="auto">
+                    <ns4:xfrm>
+                      <ns4:off x="0" y="0"/>
+                      <ns4:ext cx="5715000" cy="3667125"/>
+                    </ns4:xfrm>
+                    <ns4:prstGeom prst="rect">
+                      <ns4:avLst/>
+                    </ns4:prstGeom>
+                  </ns5:spPr>
+                </ns5:pic>
+              </ns4:graphicData>
+            </ns4:graphic>
+          </ns3:inline>
         </w:drawing>
       </w:r>
     </w:p>
@@ -4102,42 +4126,42 @@
       </w:pPr>
       <w:r>
         <w:drawing>
-          <wp:inline distT="0" distB="0" distL="0" distR="0">
-            <wp:extent cx="5715000" cy="3667125"/>
-            <wp:effectExtent t="0" r="0" b="0" l="0"/>
-            <wp:docPr id="1" name="" descr="" title=""/>
-            <wp:cNvGraphicFramePr>
-              <a:graphicFrameLocks xmlns:a="http://schemas.openxmlformats.org/drawingml/2006/main" noChangeAspect="1"/>
-            </wp:cNvGraphicFramePr>
-            <a:graphic xmlns:a="http://schemas.openxmlformats.org/drawingml/2006/main">
-              <a:graphicData uri="http://schemas.openxmlformats.org/drawingml/2006/picture">
-                <pic:pic xmlns:pic="http://schemas.openxmlformats.org/drawingml/2006/picture">
-                  <pic:nvPicPr>
-                    <pic:cNvPr id="0" name="" descr=""/>
-                    <pic:cNvPicPr>
-                      <a:picLocks noChangeAspect="1" noChangeArrowheads="1"/>
-                    </pic:cNvPicPr>
-                  </pic:nvPicPr>
-                  <pic:blipFill>
-                    <a:blip r:embed="rId12" cstate="none"/>
-                    <a:srcRect/>
-                    <a:stretch>
-                      <a:fillRect/>
-                    </a:stretch>
-                  </pic:blipFill>
-                  <pic:spPr bwMode="auto">
-                    <a:xfrm>
-                      <a:off x="0" y="0"/>
-                      <a:ext cx="5715000" cy="3667125"/>
-                    </a:xfrm>
-                    <a:prstGeom prst="rect">
-                      <a:avLst/>
-                    </a:prstGeom>
-                  </pic:spPr>
-                </pic:pic>
-              </a:graphicData>
-            </a:graphic>
-          </wp:inline>
+          <ns3:inline distT="0" distB="0" distL="0" distR="0">
+            <ns3:extent cx="5715000" cy="3667125"/>
+            <ns3:effectExtent t="0" r="0" b="0" l="0"/>
+            <ns3:docPr id="1" name="" descr="" title=""/>
+            <ns3:cNvGraphicFramePr>
+              <ns4:graphicFrameLocks noChangeAspect="1"/>
+            </ns3:cNvGraphicFramePr>
+            <ns4:graphic>
+              <ns4:graphicData uri="http://schemas.openxmlformats.org/drawingml/2006/picture">
+                <ns5:pic>
+                  <ns5:nvPicPr>
+                    <ns5:cNvPr id="0" name="" descr=""/>
+                    <ns5:cNvPicPr>
+                      <ns4:picLocks noChangeAspect="1" noChangeArrowheads="1"/>
+                    </ns5:cNvPicPr>
+                  </ns5:nvPicPr>
+                  <ns5:blipFill>
+                    <ns4:blip ns2:embed="rId12" cstate="none"/>
+                    <ns4:srcRect/>
+                    <ns4:stretch>
+                      <ns4:fillRect/>
+                    </ns4:stretch>
+                  </ns5:blipFill>
+                  <ns5:spPr bwMode="auto">
+                    <ns4:xfrm>
+                      <ns4:off x="0" y="0"/>
+                      <ns4:ext cx="5715000" cy="3667125"/>
+                    </ns4:xfrm>
+                    <ns4:prstGeom prst="rect">
+                      <ns4:avLst/>
+                    </ns4:prstGeom>
+                  </ns5:spPr>
+                </ns5:pic>
+              </ns4:graphicData>
+            </ns4:graphic>
+          </ns3:inline>
         </w:drawing>
       </w:r>
     </w:p>
@@ -4272,42 +4296,42 @@
       </w:pPr>
       <w:r>
         <w:drawing>
-          <wp:inline distT="0" distB="0" distL="0" distR="0">
-            <wp:extent cx="5715000" cy="3667125"/>
-            <wp:effectExtent t="0" r="0" b="0" l="0"/>
-            <wp:docPr id="1" name="" descr="" title=""/>
-            <wp:cNvGraphicFramePr>
-              <a:graphicFrameLocks xmlns:a="http://schemas.openxmlformats.org/drawingml/2006/main" noChangeAspect="1"/>
-            </wp:cNvGraphicFramePr>
-            <a:graphic xmlns:a="http://schemas.openxmlformats.org/drawingml/2006/main">
-              <a:graphicData uri="http://schemas.openxmlformats.org/drawingml/2006/picture">
-                <pic:pic xmlns:pic="http://schemas.openxmlformats.org/drawingml/2006/picture">
-                  <pic:nvPicPr>
-                    <pic:cNvPr id="0" name="" descr=""/>
-                    <pic:cNvPicPr>
-                      <a:picLocks noChangeAspect="1" noChangeArrowheads="1"/>
-                    </pic:cNvPicPr>
-                  </pic:nvPicPr>
-                  <pic:blipFill>
-                    <a:blip r:embed="rId13" cstate="none"/>
-                    <a:srcRect/>
-                    <a:stretch>
-                      <a:fillRect/>
-                    </a:stretch>
-                  </pic:blipFill>
-                  <pic:spPr bwMode="auto">
-                    <a:xfrm>
-                      <a:off x="0" y="0"/>
-                      <a:ext cx="5715000" cy="3667125"/>
-                    </a:xfrm>
-                    <a:prstGeom prst="rect">
-                      <a:avLst/>
-                    </a:prstGeom>
-                  </pic:spPr>
-                </pic:pic>
-              </a:graphicData>
-            </a:graphic>
-          </wp:inline>
+          <ns3:inline distT="0" distB="0" distL="0" distR="0">
+            <ns3:extent cx="5715000" cy="3667125"/>
+            <ns3:effectExtent t="0" r="0" b="0" l="0"/>
+            <ns3:docPr id="1" name="" descr="" title=""/>
+            <ns3:cNvGraphicFramePr>
+              <ns4:graphicFrameLocks noChangeAspect="1"/>
+            </ns3:cNvGraphicFramePr>
+            <ns4:graphic>
+              <ns4:graphicData uri="http://schemas.openxmlformats.org/drawingml/2006/picture">
+                <ns5:pic>
+                  <ns5:nvPicPr>
+                    <ns5:cNvPr id="0" name="" descr=""/>
+                    <ns5:cNvPicPr>
+                      <ns4:picLocks noChangeAspect="1" noChangeArrowheads="1"/>
+                    </ns5:cNvPicPr>
+                  </ns5:nvPicPr>
+                  <ns5:blipFill>
+                    <ns4:blip ns2:embed="rId13" cstate="none"/>
+                    <ns4:srcRect/>
+                    <ns4:stretch>
+                      <ns4:fillRect/>
+                    </ns4:stretch>
+                  </ns5:blipFill>
+                  <ns5:spPr bwMode="auto">
+                    <ns4:xfrm>
+                      <ns4:off x="0" y="0"/>
+                      <ns4:ext cx="5715000" cy="3667125"/>
+                    </ns4:xfrm>
+                    <ns4:prstGeom prst="rect">
+                      <ns4:avLst/>
+                    </ns4:prstGeom>
+                  </ns5:spPr>
+                </ns5:pic>
+              </ns4:graphicData>
+            </ns4:graphic>
+          </ns3:inline>
         </w:drawing>
       </w:r>
     </w:p>
@@ -4522,7 +4546,7 @@
                 <w:sz w:val="19"/>
                 <w:szCs w:val="19"/>
               </w:rPr>
-              <w:t xml:space="preserve">  src: "https://pub-9e6e581c8fe44c95ae384e5c52d37302.r2.dev/demo-video.mp4"</w:t>
+              <w:t xml:space="preserve">src: "https://pub-47193023d3ed40ca9b2bd213e753ba75.r2.dev/example-video.mp4"</w:t>
             </w:r>
           </w:p>
           <w:p>
@@ -4632,7 +4656,7 @@
                 <w:sz w:val="21"/>
                 <w:szCs w:val="21"/>
               </w:rPr>
-              <w:t xml:space="preserve">On this website the video is set only in the frontmatter </w:t>
+              <w:t xml:space="preserve">For a normal project video panel, use the frontmatter video block above. To place a video inside the story text, put a Markdown video link on its own line, for example: [Video: Inline demo video](https://.../project-demo.mp4). The word Video: tells the website to show a video player instead of a normal link.</w:t>
             </w:r>
             <w:r>
               <w:rPr>
@@ -4644,14 +4668,14 @@
                 <w:szCs w:val="20"/>
                 <w:shd w:fill="ECECEC" w:color="auto" w:val="clear"/>
               </w:rPr>
-              <w:t xml:space="preserve">video</w:t>
+              <w:t xml:space="preserve"/>
             </w:r>
             <w:r>
               <w:rPr>
                 <w:sz w:val="21"/>
                 <w:szCs w:val="21"/>
               </w:rPr>
-              <w:t xml:space="preserve"> block. Unlike an image, you do not place a video inside the body text — the site builds the video player for you from these settings.</w:t>
+              <w:t xml:space="preserve"/>
             </w:r>
           </w:p>
         </w:tc>
@@ -4746,42 +4770,42 @@
       </w:pPr>
       <w:r>
         <w:drawing>
-          <wp:inline distT="0" distB="0" distL="0" distR="0">
-            <wp:extent cx="5715000" cy="3667125"/>
-            <wp:effectExtent t="0" r="0" b="0" l="0"/>
-            <wp:docPr id="1" name="" descr="" title=""/>
-            <wp:cNvGraphicFramePr>
-              <a:graphicFrameLocks xmlns:a="http://schemas.openxmlformats.org/drawingml/2006/main" noChangeAspect="1"/>
-            </wp:cNvGraphicFramePr>
-            <a:graphic xmlns:a="http://schemas.openxmlformats.org/drawingml/2006/main">
-              <a:graphicData uri="http://schemas.openxmlformats.org/drawingml/2006/picture">
-                <pic:pic xmlns:pic="http://schemas.openxmlformats.org/drawingml/2006/picture">
-                  <pic:nvPicPr>
-                    <pic:cNvPr id="0" name="" descr=""/>
-                    <pic:cNvPicPr>
-                      <a:picLocks noChangeAspect="1" noChangeArrowheads="1"/>
-                    </pic:cNvPicPr>
-                  </pic:nvPicPr>
-                  <pic:blipFill>
-                    <a:blip r:embed="rId14" cstate="none"/>
-                    <a:srcRect/>
-                    <a:stretch>
-                      <a:fillRect/>
-                    </a:stretch>
-                  </pic:blipFill>
-                  <pic:spPr bwMode="auto">
-                    <a:xfrm>
-                      <a:off x="0" y="0"/>
-                      <a:ext cx="5715000" cy="3667125"/>
-                    </a:xfrm>
-                    <a:prstGeom prst="rect">
-                      <a:avLst/>
-                    </a:prstGeom>
-                  </pic:spPr>
-                </pic:pic>
-              </a:graphicData>
-            </a:graphic>
-          </wp:inline>
+          <ns3:inline distT="0" distB="0" distL="0" distR="0">
+            <ns3:extent cx="5715000" cy="3667125"/>
+            <ns3:effectExtent t="0" r="0" b="0" l="0"/>
+            <ns3:docPr id="1" name="" descr="" title=""/>
+            <ns3:cNvGraphicFramePr>
+              <ns4:graphicFrameLocks noChangeAspect="1"/>
+            </ns3:cNvGraphicFramePr>
+            <ns4:graphic>
+              <ns4:graphicData uri="http://schemas.openxmlformats.org/drawingml/2006/picture">
+                <ns5:pic>
+                  <ns5:nvPicPr>
+                    <ns5:cNvPr id="0" name="" descr=""/>
+                    <ns5:cNvPicPr>
+                      <ns4:picLocks noChangeAspect="1" noChangeArrowheads="1"/>
+                    </ns5:cNvPicPr>
+                  </ns5:nvPicPr>
+                  <ns5:blipFill>
+                    <ns4:blip ns2:embed="rId14" cstate="none"/>
+                    <ns4:srcRect/>
+                    <ns4:stretch>
+                      <ns4:fillRect/>
+                    </ns4:stretch>
+                  </ns5:blipFill>
+                  <ns5:spPr bwMode="auto">
+                    <ns4:xfrm>
+                      <ns4:off x="0" y="0"/>
+                      <ns4:ext cx="5715000" cy="3667125"/>
+                    </ns4:xfrm>
+                    <ns4:prstGeom prst="rect">
+                      <ns4:avLst/>
+                    </ns4:prstGeom>
+                  </ns5:spPr>
+                </ns5:pic>
+              </ns4:graphicData>
+            </ns4:graphic>
+          </ns3:inline>
         </w:drawing>
       </w:r>
     </w:p>
@@ -5087,7 +5111,7 @@
           <w:sz w:val="22"/>
           <w:szCs w:val="22"/>
         </w:rPr>
-        <w:t xml:space="preserve">[  ]  The video file is uploaded to R2, not GitHub.</w:t>
+        <w:t xml:space="preserve">[  ]  The video file is compressed and uploaded to R2, not GitHub.</w:t>
       </w:r>
     </w:p>
     <w:p>
@@ -5671,42 +5695,42 @@
       </w:pPr>
       <w:r>
         <w:drawing>
-          <wp:inline distT="0" distB="0" distL="0" distR="0">
-            <wp:extent cx="5715000" cy="3219450"/>
-            <wp:effectExtent t="0" r="0" b="0" l="0"/>
-            <wp:docPr id="1" name="" descr="" title=""/>
-            <wp:cNvGraphicFramePr>
-              <a:graphicFrameLocks xmlns:a="http://schemas.openxmlformats.org/drawingml/2006/main" noChangeAspect="1"/>
-            </wp:cNvGraphicFramePr>
-            <a:graphic xmlns:a="http://schemas.openxmlformats.org/drawingml/2006/main">
-              <a:graphicData uri="http://schemas.openxmlformats.org/drawingml/2006/picture">
-                <pic:pic xmlns:pic="http://schemas.openxmlformats.org/drawingml/2006/picture">
-                  <pic:nvPicPr>
-                    <pic:cNvPr id="0" name="" descr=""/>
-                    <pic:cNvPicPr>
-                      <a:picLocks noChangeAspect="1" noChangeArrowheads="1"/>
-                    </pic:cNvPicPr>
-                  </pic:nvPicPr>
-                  <pic:blipFill>
-                    <a:blip r:embed="rId15" cstate="none"/>
-                    <a:srcRect/>
-                    <a:stretch>
-                      <a:fillRect/>
-                    </a:stretch>
-                  </pic:blipFill>
-                  <pic:spPr bwMode="auto">
-                    <a:xfrm>
-                      <a:off x="0" y="0"/>
-                      <a:ext cx="5715000" cy="3219450"/>
-                    </a:xfrm>
-                    <a:prstGeom prst="rect">
-                      <a:avLst/>
-                    </a:prstGeom>
-                  </pic:spPr>
-                </pic:pic>
-              </a:graphicData>
-            </a:graphic>
-          </wp:inline>
+          <ns3:inline distT="0" distB="0" distL="0" distR="0">
+            <ns3:extent cx="5715000" cy="3219450"/>
+            <ns3:effectExtent t="0" r="0" b="0" l="0"/>
+            <ns3:docPr id="1" name="" descr="" title=""/>
+            <ns3:cNvGraphicFramePr>
+              <ns4:graphicFrameLocks noChangeAspect="1"/>
+            </ns3:cNvGraphicFramePr>
+            <ns4:graphic>
+              <ns4:graphicData uri="http://schemas.openxmlformats.org/drawingml/2006/picture">
+                <ns5:pic>
+                  <ns5:nvPicPr>
+                    <ns5:cNvPr id="0" name="" descr=""/>
+                    <ns5:cNvPicPr>
+                      <ns4:picLocks noChangeAspect="1" noChangeArrowheads="1"/>
+                    </ns5:cNvPicPr>
+                  </ns5:nvPicPr>
+                  <ns5:blipFill>
+                    <ns4:blip ns2:embed="rId15" cstate="none"/>
+                    <ns4:srcRect/>
+                    <ns4:stretch>
+                      <ns4:fillRect/>
+                    </ns4:stretch>
+                  </ns5:blipFill>
+                  <ns5:spPr bwMode="auto">
+                    <ns4:xfrm>
+                      <ns4:off x="0" y="0"/>
+                      <ns4:ext cx="5715000" cy="3219450"/>
+                    </ns4:xfrm>
+                    <ns4:prstGeom prst="rect">
+                      <ns4:avLst/>
+                    </ns4:prstGeom>
+                  </ns5:spPr>
+                </ns5:pic>
+              </ns4:graphicData>
+            </ns4:graphic>
+          </ns3:inline>
         </w:drawing>
       </w:r>
     </w:p>
@@ -5883,7 +5907,7 @@
       </w:pPr>
     </w:p>
     <w:sectPr>
-      <w:footerReference w:type="default" r:id="rId7"/>
+      <w:footerReference w:type="default" ns2:id="rId7"/>
       <w:pgSz w:w="12240" w:h="15840" w:orient="portrait"/>
       <w:pgMar w:top="1440" w:right="1440" w:bottom="1440" w:left="1440" w:header="708" w:footer="708" w:gutter="0"/>
       <w:pgNumType/>

</xml_diff>

<commit_message>
Expand admin manual with GitHub Desktop walkthrough
</commit_message>
<xml_diff>
--- a/Media_Contribution_Manual_Admin.docx
+++ b/Media_Contribution_Manual_Admin.docx
@@ -40,7 +40,7 @@
           <w:sz w:val="20"/>
           <w:szCs w:val="20"/>
         </w:rPr>
-        <w:t xml:space="preserve">Last updated: 5 July 2026</w:t>
+        <w:t>Last updated: 15 July 2026</w:t>
       </w:r>
     </w:p>
     <w:p>
@@ -64,6 +64,50 @@
             <w:u w:val="single" w:color="1D4ED8"/>
           </w:rPr>
           <w:t xml:space="preserve"/>
+        </w:r>
+      </w:hyperlink>
+    </w:p>
+    <w:p>
+      <w:pPr>
+        <w:spacing w:after="40" w:line="269" w:lineRule="auto"/>
+      </w:pPr>
+      <w:r>
+        <w:rPr>
+          <w:rFonts w:ascii="Arial" w:hAnsi="Arial"/>
+          <w:b/>
+          <w:sz w:val="22"/>
+        </w:rPr>
+        <w:t xml:space="preserve">Where to access this guide: </w:t>
+      </w:r>
+      <w:hyperlink ns2:id="rId16">
+        <w:r>
+          <w:rPr>
+            <w:color w:val="2563EB"/>
+            <w:u w:val="single"/>
+          </w:rPr>
+          <w:t>Media_Contribution_Manual_Admin.docx on GitHub</w:t>
+        </w:r>
+      </w:hyperlink>
+    </w:p>
+    <w:p>
+      <w:pPr>
+        <w:spacing w:after="160" w:line="269" w:lineRule="auto"/>
+      </w:pPr>
+      <w:r>
+        <w:rPr>
+          <w:rFonts w:ascii="Arial" w:hAnsi="Arial"/>
+          <w:b/>
+          <w:sz w:val="22"/>
+        </w:rPr>
+        <w:t xml:space="preserve">Website files: </w:t>
+      </w:r>
+      <w:hyperlink ns2:id="rId18">
+        <w:r>
+          <w:rPr>
+            <w:color w:val="2563EB"/>
+            <w:u w:val="single"/>
+          </w:rPr>
+          <w:t>CapstoneCRAC/CapstoneCRAC.github.io</w:t>
         </w:r>
       </w:hyperlink>
     </w:p>
@@ -4686,6 +4730,11 @@
         <w:spacing w:after="140"/>
       </w:pPr>
     </w:p>
+    <w:p>
+      <w:r>
+        <w:br w:type="page"/>
+      </w:r>
+    </w:p>
     <w:tbl>
       <w:tblPr>
         <w:tblW w:type="dxa" w:w="9360"/>
@@ -5672,19 +5721,661 @@
         <w:pStyle w:val="Heading1"/>
       </w:pPr>
       <w:r>
-        <w:t xml:space="preserve">8.  GitHub Desktop workflow for admins</w:t>
-      </w:r>
-    </w:p>
-    <w:p>
-      <w:pPr>
-        <w:spacing w:after="120"/>
-      </w:pPr>
-      <w:r>
-        <w:rPr>
-          <w:sz w:val="22"/>
-          <w:szCs w:val="22"/>
-        </w:rPr>
-        <w:t xml:space="preserve">You can use GitHub Desktop instead of typing Git commands. The important thing is the order: get the latest version first, then save your change, then send it up.</w:t>
+        <w:t>8.  First-time setup and GitHub Desktop workflow for admins</w:t>
+      </w:r>
+    </w:p>
+    <w:p>
+      <w:pPr>
+        <w:spacing w:after="160" w:line="269" w:lineRule="auto"/>
+      </w:pPr>
+      <w:r>
+        <w:rPr>
+          <w:rFonts w:ascii="Arial" w:hAnsi="Arial"/>
+          <w:sz w:val="22"/>
+        </w:rPr>
+        <w:t>Use GitHub Desktop so you do not need to type Git commands. The first-time setup is done once. After that, always get the latest version before editing, then commit and push when your work is finished.</w:t>
+      </w:r>
+    </w:p>
+    <w:p>
+      <w:pPr>
+        <w:pStyle w:val="Heading2"/>
+        <w:keepNext/>
+      </w:pPr>
+      <w:r>
+        <w:t>Before the first use</w:t>
+      </w:r>
+    </w:p>
+    <w:p>
+      <w:pPr>
+        <w:spacing w:after="120" w:line="269" w:lineRule="auto"/>
+      </w:pPr>
+      <w:r>
+        <w:rPr>
+          <w:rFonts w:ascii="Arial" w:hAnsi="Arial"/>
+          <w:i w:val="0"/>
+          <w:sz w:val="22"/>
+        </w:rPr>
+        <w:t>Ask the website maintainer to invite the email address used for your GitHub account. Then download GitHub Desktop from https://desktop.github.com/, install it, and sign in with the invited GitHub account.</w:t>
+      </w:r>
+    </w:p>
+    <w:p>
+      <w:pPr>
+        <w:spacing w:after="120" w:line="269" w:lineRule="auto"/>
+      </w:pPr>
+      <w:r>
+        <w:rPr>
+          <w:rFonts w:ascii="Arial" w:hAnsi="Arial"/>
+          <w:i/>
+          <w:sz w:val="22"/>
+        </w:rPr>
+        <w:t>You do not need to type or paste a repository URL. Follow the buttons shown below and select the repository from your signed-in GitHub.com account.</w:t>
+      </w:r>
+    </w:p>
+    <w:p>
+      <w:r>
+        <w:br w:type="page"/>
+      </w:r>
+    </w:p>
+    <w:p>
+      <w:pPr>
+        <w:pStyle w:val="Heading2"/>
+        <w:keepNext/>
+      </w:pPr>
+      <w:r>
+        <w:t>Step 1 — Open the repository on GitHub</w:t>
+      </w:r>
+    </w:p>
+    <w:p>
+      <w:pPr>
+        <w:spacing w:after="120" w:line="269" w:lineRule="auto"/>
+      </w:pPr>
+      <w:r>
+        <w:rPr>
+          <w:rFonts w:ascii="Arial" w:hAnsi="Arial"/>
+          <w:i w:val="0"/>
+          <w:sz w:val="22"/>
+        </w:rPr>
+        <w:t>In Chrome, open https://github.com/CapstoneCRAC/CapstoneCRAC.github.io. Confirm that the repository name at the top is CapstoneCRAC.github.io.</w:t>
+      </w:r>
+    </w:p>
+    <w:p>
+      <w:pPr>
+        <w:keepNext/>
+        <w:spacing w:after="60"/>
+        <w:jc w:val="center"/>
+      </w:pPr>
+      <w:r>
+        <w:drawing>
+          <ns3:inline>
+            <ns3:extent cx="5806440" cy="4958597"/>
+            <ns3:docPr id="2" name="Picture 2" descr="GitHub repository page for CapstoneCRAC.github.io." title="GitHub repository page for CapstoneCRAC.github.io."/>
+            <ns3:cNvGraphicFramePr>
+              <ns4:graphicFrameLocks noChangeAspect="1"/>
+            </ns3:cNvGraphicFramePr>
+            <ns4:graphic>
+              <ns4:graphicData uri="http://schemas.openxmlformats.org/drawingml/2006/picture">
+                <ns5:pic>
+                  <ns5:nvPicPr>
+                    <ns5:cNvPr id="0" name="01-repository.png"/>
+                    <ns5:cNvPicPr/>
+                  </ns5:nvPicPr>
+                  <ns5:blipFill>
+                    <ns4:blip ns2:embed="rId19"/>
+                    <ns4:stretch>
+                      <ns4:fillRect/>
+                    </ns4:stretch>
+                  </ns5:blipFill>
+                  <ns5:spPr>
+                    <ns4:xfrm>
+                      <ns4:off x="0" y="0"/>
+                      <ns4:ext cx="5806440" cy="4958597"/>
+                    </ns4:xfrm>
+                    <ns4:prstGeom prst="rect"/>
+                  </ns5:spPr>
+                </ns5:pic>
+              </ns4:graphicData>
+            </ns4:graphic>
+          </ns3:inline>
+        </w:drawing>
+      </w:r>
+    </w:p>
+    <w:p>
+      <w:pPr>
+        <w:keepNext w:val="0"/>
+        <w:spacing w:after="80"/>
+      </w:pPr>
+      <w:r>
+        <w:rPr>
+          <w:rFonts w:ascii="Arial" w:hAnsi="Arial"/>
+          <w:b/>
+          <w:color w:val="1F2937"/>
+          <w:sz w:val="21"/>
+        </w:rPr>
+        <w:t>Figure GD-01 — The CapstoneCRAC.github.io repository page</w:t>
+      </w:r>
+    </w:p>
+    <w:p>
+      <w:r>
+        <w:br w:type="page"/>
+      </w:r>
+    </w:p>
+    <w:p>
+      <w:pPr>
+        <w:pStyle w:val="Heading2"/>
+        <w:keepNext/>
+      </w:pPr>
+      <w:r>
+        <w:t>Step 2 — Click Code, then Open with GitHub Desktop</w:t>
+      </w:r>
+    </w:p>
+    <w:p>
+      <w:pPr>
+        <w:spacing w:after="120" w:line="269" w:lineRule="auto"/>
+      </w:pPr>
+      <w:r>
+        <w:rPr>
+          <w:rFonts w:ascii="Arial" w:hAnsi="Arial"/>
+          <w:i w:val="0"/>
+          <w:sz w:val="22"/>
+        </w:rPr>
+        <w:t>Click the green Code button. In the Local tab, click Open with GitHub Desktop. Ignore the HTTPS address shown above it; administrators do not need to copy or enter that address.</w:t>
+      </w:r>
+    </w:p>
+    <w:p>
+      <w:pPr>
+        <w:keepNext/>
+        <w:spacing w:after="60"/>
+        <w:jc w:val="center"/>
+      </w:pPr>
+      <w:r>
+        <w:drawing>
+          <ns3:inline>
+            <ns3:extent cx="3749039" cy="4319959"/>
+            <ns3:docPr id="3" name="Picture 3" descr="GitHub Code menu with Open with GitHub Desktop highlighted." title="GitHub Code menu with Open with GitHub Desktop highlighted."/>
+            <ns3:cNvGraphicFramePr>
+              <ns4:graphicFrameLocks noChangeAspect="1"/>
+            </ns3:cNvGraphicFramePr>
+            <ns4:graphic>
+              <ns4:graphicData uri="http://schemas.openxmlformats.org/drawingml/2006/picture">
+                <ns5:pic>
+                  <ns5:nvPicPr>
+                    <ns5:cNvPr id="0" name="02-code-menu.png"/>
+                    <ns5:cNvPicPr/>
+                  </ns5:nvPicPr>
+                  <ns5:blipFill>
+                    <ns4:blip ns2:embed="rId20"/>
+                    <ns4:stretch>
+                      <ns4:fillRect/>
+                    </ns4:stretch>
+                  </ns5:blipFill>
+                  <ns5:spPr>
+                    <ns4:xfrm>
+                      <ns4:off x="0" y="0"/>
+                      <ns4:ext cx="3749039" cy="4319959"/>
+                    </ns4:xfrm>
+                    <ns4:prstGeom prst="rect"/>
+                  </ns5:spPr>
+                </ns5:pic>
+              </ns4:graphicData>
+            </ns4:graphic>
+          </ns3:inline>
+        </w:drawing>
+      </w:r>
+    </w:p>
+    <w:p>
+      <w:pPr>
+        <w:keepNext w:val="0"/>
+        <w:spacing w:after="80"/>
+      </w:pPr>
+      <w:r>
+        <w:rPr>
+          <w:rFonts w:ascii="Arial" w:hAnsi="Arial"/>
+          <w:b/>
+          <w:color w:val="1F2937"/>
+          <w:sz w:val="21"/>
+        </w:rPr>
+        <w:t>Figure GD-02 — Open with GitHub Desktop in the Code menu</w:t>
+      </w:r>
+    </w:p>
+    <w:p>
+      <w:pPr>
+        <w:spacing w:after="120" w:line="269" w:lineRule="auto"/>
+      </w:pPr>
+      <w:r>
+        <w:rPr>
+          <w:rFonts w:ascii="Arial" w:hAnsi="Arial"/>
+          <w:i w:val="0"/>
+          <w:sz w:val="22"/>
+        </w:rPr>
+        <w:t>Chrome may ask for confirmation. Click Open GitHub Desktop. Leave the Always allow checkbox unticked unless this is your own permanent work computer.</w:t>
+      </w:r>
+    </w:p>
+    <w:p>
+      <w:pPr>
+        <w:keepNext/>
+        <w:spacing w:after="60"/>
+        <w:jc w:val="center"/>
+      </w:pPr>
+      <w:r>
+        <w:drawing>
+          <ns3:inline>
+            <ns3:extent cx="4023360" cy="1612475"/>
+            <ns3:docPr id="4" name="Picture 4" descr="Chrome confirmation dialog for opening GitHub Desktop." title="Chrome confirmation dialog for opening GitHub Desktop."/>
+            <ns3:cNvGraphicFramePr>
+              <ns4:graphicFrameLocks noChangeAspect="1"/>
+            </ns3:cNvGraphicFramePr>
+            <ns4:graphic>
+              <ns4:graphicData uri="http://schemas.openxmlformats.org/drawingml/2006/picture">
+                <ns5:pic>
+                  <ns5:nvPicPr>
+                    <ns5:cNvPr id="0" name="03-open-prompt.png"/>
+                    <ns5:cNvPicPr/>
+                  </ns5:nvPicPr>
+                  <ns5:blipFill>
+                    <ns4:blip ns2:embed="rId21"/>
+                    <ns4:stretch>
+                      <ns4:fillRect/>
+                    </ns4:stretch>
+                  </ns5:blipFill>
+                  <ns5:spPr>
+                    <ns4:xfrm>
+                      <ns4:off x="0" y="0"/>
+                      <ns4:ext cx="4023360" cy="1612475"/>
+                    </ns4:xfrm>
+                    <ns4:prstGeom prst="rect"/>
+                  </ns5:spPr>
+                </ns5:pic>
+              </ns4:graphicData>
+            </ns4:graphic>
+          </ns3:inline>
+        </w:drawing>
+      </w:r>
+    </w:p>
+    <w:p>
+      <w:pPr>
+        <w:keepNext w:val="0"/>
+        <w:spacing w:after="80"/>
+      </w:pPr>
+      <w:r>
+        <w:rPr>
+          <w:rFonts w:ascii="Arial" w:hAnsi="Arial"/>
+          <w:b/>
+          <w:color w:val="1F2937"/>
+          <w:sz w:val="21"/>
+        </w:rPr>
+        <w:t>Figure GD-03 — Chrome asks permission to open GitHub Desktop</w:t>
+      </w:r>
+    </w:p>
+    <w:p>
+      <w:r>
+        <w:br w:type="page"/>
+      </w:r>
+    </w:p>
+    <w:p>
+      <w:pPr>
+        <w:pStyle w:val="Heading2"/>
+        <w:keepNext/>
+      </w:pPr>
+      <w:r>
+        <w:t>Step 3 — Choose the repository and local folder</w:t>
+      </w:r>
+    </w:p>
+    <w:p>
+      <w:pPr>
+        <w:spacing w:after="120" w:line="269" w:lineRule="auto"/>
+      </w:pPr>
+      <w:r>
+        <w:rPr>
+          <w:rFonts w:ascii="Arial" w:hAnsi="Arial"/>
+          <w:i w:val="0"/>
+          <w:sz w:val="22"/>
+        </w:rPr>
+        <w:t>GitHub Desktop should already know which repository to open. If the repository list appears, stay on the GitHub.com tab, search for CapstoneCRAC, select CapstoneCRAC/CapstoneCRAC.github.io, and click Choose to select a folder you can find later, such as Documents/GitHub. Then click Clone.</w:t>
+      </w:r>
+    </w:p>
+    <w:p>
+      <w:pPr>
+        <w:keepNext/>
+        <w:spacing w:after="60"/>
+        <w:jc w:val="center"/>
+      </w:pPr>
+      <w:r>
+        <w:drawing>
+          <ns3:inline>
+            <ns3:extent cx="5074920" cy="5444677"/>
+            <ns3:docPr id="5" name="Picture 5" descr="GitHub Desktop clone dialog with the CapstoneCRAC repository and Clone button highlighted." title="GitHub Desktop clone dialog with the CapstoneCRAC repository and Clone button highlighted."/>
+            <ns3:cNvGraphicFramePr>
+              <ns4:graphicFrameLocks noChangeAspect="1"/>
+            </ns3:cNvGraphicFramePr>
+            <ns4:graphic>
+              <ns4:graphicData uri="http://schemas.openxmlformats.org/drawingml/2006/picture">
+                <ns5:pic>
+                  <ns5:nvPicPr>
+                    <ns5:cNvPr id="0" name="04-select-repository.png"/>
+                    <ns5:cNvPicPr/>
+                  </ns5:nvPicPr>
+                  <ns5:blipFill>
+                    <ns4:blip ns2:embed="rId22"/>
+                    <ns4:stretch>
+                      <ns4:fillRect/>
+                    </ns4:stretch>
+                  </ns5:blipFill>
+                  <ns5:spPr>
+                    <ns4:xfrm>
+                      <ns4:off x="0" y="0"/>
+                      <ns4:ext cx="5074920" cy="5444677"/>
+                    </ns4:xfrm>
+                    <ns4:prstGeom prst="rect"/>
+                  </ns5:spPr>
+                </ns5:pic>
+              </ns4:graphicData>
+            </ns4:graphic>
+          </ns3:inline>
+        </w:drawing>
+      </w:r>
+    </w:p>
+    <w:p>
+      <w:pPr>
+        <w:keepNext w:val="0"/>
+        <w:spacing w:after="80"/>
+      </w:pPr>
+      <w:r>
+        <w:rPr>
+          <w:rFonts w:ascii="Arial" w:hAnsi="Arial"/>
+          <w:b/>
+          <w:color w:val="1F2937"/>
+          <w:sz w:val="21"/>
+        </w:rPr>
+        <w:t>Figure GD-04 — Select the repository without entering a URL</w:t>
+      </w:r>
+    </w:p>
+    <w:p>
+      <w:pPr>
+        <w:spacing w:after="120" w:line="269" w:lineRule="auto"/>
+      </w:pPr>
+      <w:r>
+        <w:rPr>
+          <w:rFonts w:ascii="Arial" w:hAnsi="Arial"/>
+          <w:i/>
+          <w:sz w:val="22"/>
+        </w:rPr>
+        <w:t>The example path uses YourName only as a placeholder. Choose a real folder on your own computer. Do not place the project inside another copy of the same project.</w:t>
+      </w:r>
+    </w:p>
+    <w:p>
+      <w:r>
+        <w:br w:type="page"/>
+      </w:r>
+    </w:p>
+    <w:p>
+      <w:pPr>
+        <w:pStyle w:val="Heading2"/>
+        <w:keepNext/>
+      </w:pPr>
+      <w:r>
+        <w:t>Step 4 — Pull the latest version before editing</w:t>
+      </w:r>
+    </w:p>
+    <w:p>
+      <w:pPr>
+        <w:spacing w:after="120" w:line="269" w:lineRule="auto"/>
+      </w:pPr>
+      <w:r>
+        <w:rPr>
+          <w:rFonts w:ascii="Arial" w:hAnsi="Arial"/>
+          <w:i w:val="0"/>
+          <w:sz w:val="22"/>
+        </w:rPr>
+        <w:t>At the top of GitHub Desktop, confirm Current Repository is CapstoneCRAC.github.io and Current Branch is main. Click Fetch origin. If the button changes to Pull origin, click Pull origin and wait for it to finish before opening or editing files.</w:t>
+      </w:r>
+    </w:p>
+    <w:p>
+      <w:pPr>
+        <w:keepNext/>
+        <w:spacing w:after="60"/>
+        <w:jc w:val="center"/>
+      </w:pPr>
+      <w:r>
+        <w:drawing>
+          <ns3:inline>
+            <ns3:extent cx="5806440" cy="3999457"/>
+            <ns3:docPr id="6" name="Picture 6" descr="GitHub Desktop showing the current repository, main branch, Fetch origin, and Show in Finder." title="GitHub Desktop showing the current repository, main branch, Fetch origin, and Show in Finder."/>
+            <ns3:cNvGraphicFramePr>
+              <ns4:graphicFrameLocks noChangeAspect="1"/>
+            </ns3:cNvGraphicFramePr>
+            <ns4:graphic>
+              <ns4:graphicData uri="http://schemas.openxmlformats.org/drawingml/2006/picture">
+                <ns5:pic>
+                  <ns5:nvPicPr>
+                    <ns5:cNvPr id="0" name="05-fetch-complete.png"/>
+                    <ns5:cNvPicPr/>
+                  </ns5:nvPicPr>
+                  <ns5:blipFill>
+                    <ns4:blip ns2:embed="rId23"/>
+                    <ns4:stretch>
+                      <ns4:fillRect/>
+                    </ns4:stretch>
+                  </ns5:blipFill>
+                  <ns5:spPr>
+                    <ns4:xfrm>
+                      <ns4:off x="0" y="0"/>
+                      <ns4:ext cx="5806440" cy="3999457"/>
+                    </ns4:xfrm>
+                    <ns4:prstGeom prst="rect"/>
+                  </ns5:spPr>
+                </ns5:pic>
+              </ns4:graphicData>
+            </ns4:graphic>
+          </ns3:inline>
+        </w:drawing>
+      </w:r>
+    </w:p>
+    <w:p>
+      <w:pPr>
+        <w:keepNext w:val="0"/>
+        <w:spacing w:after="80"/>
+      </w:pPr>
+      <w:r>
+        <w:rPr>
+          <w:rFonts w:ascii="Arial" w:hAnsi="Arial"/>
+          <w:b/>
+          <w:color w:val="1F2937"/>
+          <w:sz w:val="21"/>
+        </w:rPr>
+        <w:t>Figure GD-05 — Fetch or pull updates before every editing session</w:t>
+      </w:r>
+    </w:p>
+    <w:p>
+      <w:r>
+        <w:br w:type="page"/>
+      </w:r>
+    </w:p>
+    <w:p>
+      <w:pPr>
+        <w:pStyle w:val="Heading2"/>
+        <w:keepNext/>
+      </w:pPr>
+      <w:r>
+        <w:t>Step 5 — Find the downloaded files</w:t>
+      </w:r>
+    </w:p>
+    <w:p>
+      <w:pPr>
+        <w:spacing w:after="120" w:line="269" w:lineRule="auto"/>
+      </w:pPr>
+      <w:r>
+        <w:rPr>
+          <w:rFonts w:ascii="Arial" w:hAnsi="Arial"/>
+          <w:i w:val="0"/>
+          <w:sz w:val="22"/>
+        </w:rPr>
+        <w:t>Click Show in Finder. The folder GitHub Desktop selected during cloning now contains the complete website. The file Media_Contribution_Manual_Admin.docx is in this top-level folder, so you can open the guide directly from here.</w:t>
+      </w:r>
+    </w:p>
+    <w:p>
+      <w:pPr>
+        <w:keepNext/>
+        <w:spacing w:after="60"/>
+        <w:jc w:val="center"/>
+      </w:pPr>
+      <w:r>
+        <w:drawing>
+          <ns3:inline>
+            <ns3:extent cx="5806440" cy="2804567"/>
+            <ns3:docPr id="7" name="Picture 7" descr="Finder showing the cloned website files, including the administrator manual, public folder, and src folder." title="Finder showing the cloned website files, including the administrator manual, public folder, and src folder."/>
+            <ns3:cNvGraphicFramePr>
+              <ns4:graphicFrameLocks noChangeAspect="1"/>
+            </ns3:cNvGraphicFramePr>
+            <ns4:graphic>
+              <ns4:graphicData uri="http://schemas.openxmlformats.org/drawingml/2006/picture">
+                <ns5:pic>
+                  <ns5:nvPicPr>
+                    <ns5:cNvPr id="0" name="06-repository-files.png"/>
+                    <ns5:cNvPicPr/>
+                  </ns5:nvPicPr>
+                  <ns5:blipFill>
+                    <ns4:blip ns2:embed="rId24"/>
+                    <ns4:stretch>
+                      <ns4:fillRect/>
+                    </ns4:stretch>
+                  </ns5:blipFill>
+                  <ns5:spPr>
+                    <ns4:xfrm>
+                      <ns4:off x="0" y="0"/>
+                      <ns4:ext cx="5806440" cy="2804567"/>
+                    </ns4:xfrm>
+                    <ns4:prstGeom prst="rect"/>
+                  </ns5:spPr>
+                </ns5:pic>
+              </ns4:graphicData>
+            </ns4:graphic>
+          </ns3:inline>
+        </w:drawing>
+      </w:r>
+    </w:p>
+    <w:p>
+      <w:pPr>
+        <w:keepNext w:val="0"/>
+        <w:spacing w:after="80"/>
+      </w:pPr>
+      <w:r>
+        <w:rPr>
+          <w:rFonts w:ascii="Arial" w:hAnsi="Arial"/>
+          <w:b/>
+          <w:color w:val="1F2937"/>
+          <w:sz w:val="21"/>
+        </w:rPr>
+        <w:t>Figure GD-06 — The complete website folder in Finder</w:t>
+      </w:r>
+    </w:p>
+    <w:p>
+      <w:r>
+        <w:br w:type="page"/>
+      </w:r>
+    </w:p>
+    <w:p>
+      <w:pPr>
+        <w:pStyle w:val="Heading2"/>
+        <w:keepNext/>
+      </w:pPr>
+      <w:r>
+        <w:t>Step 6 — Open the project Markdown folder</w:t>
+      </w:r>
+    </w:p>
+    <w:p>
+      <w:pPr>
+        <w:spacing w:after="120" w:line="269" w:lineRule="auto"/>
+      </w:pPr>
+      <w:r>
+        <w:rPr>
+          <w:rFonts w:ascii="Arial" w:hAnsi="Arial"/>
+          <w:i w:val="0"/>
+          <w:sz w:val="22"/>
+        </w:rPr>
+        <w:t>In Finder, open src, then content, then projects. Each .md file controls one project page. For the full example with a project cover, sidebar video, inline image, and inline video, open 2025-2026-06-mandarin-pronunciation-app.md.</w:t>
+      </w:r>
+    </w:p>
+    <w:p>
+      <w:pPr>
+        <w:keepNext/>
+        <w:spacing w:after="60"/>
+        <w:jc w:val="center"/>
+      </w:pPr>
+      <w:r>
+        <w:drawing>
+          <ns3:inline>
+            <ns3:extent cx="4800600" cy="3400425"/>
+            <ns3:docPr id="8" name="Picture 8" descr="Finder showing the Markdown files in src/content/projects with the Mandarin Pronunciation App example highlighted." title="Finder showing the Markdown files in src/content/projects with the Mandarin Pronunciation App example highlighted."/>
+            <ns3:cNvGraphicFramePr>
+              <ns4:graphicFrameLocks noChangeAspect="1"/>
+            </ns3:cNvGraphicFramePr>
+            <ns4:graphic>
+              <ns4:graphicData uri="http://schemas.openxmlformats.org/drawingml/2006/picture">
+                <ns5:pic>
+                  <ns5:nvPicPr>
+                    <ns5:cNvPr id="0" name="07-project-markdown-files.png"/>
+                    <ns5:cNvPicPr/>
+                  </ns5:nvPicPr>
+                  <ns5:blipFill>
+                    <ns4:blip ns2:embed="rId25"/>
+                    <ns4:stretch>
+                      <ns4:fillRect/>
+                    </ns4:stretch>
+                  </ns5:blipFill>
+                  <ns5:spPr>
+                    <ns4:xfrm>
+                      <ns4:off x="0" y="0"/>
+                      <ns4:ext cx="4800600" cy="3400425"/>
+                    </ns4:xfrm>
+                    <ns4:prstGeom prst="rect"/>
+                  </ns5:spPr>
+                </ns5:pic>
+              </ns4:graphicData>
+            </ns4:graphic>
+          </ns3:inline>
+        </w:drawing>
+      </w:r>
+    </w:p>
+    <w:p>
+      <w:pPr>
+        <w:keepNext w:val="0"/>
+        <w:spacing w:after="80"/>
+      </w:pPr>
+      <w:r>
+        <w:rPr>
+          <w:rFonts w:ascii="Arial" w:hAnsi="Arial"/>
+          <w:b/>
+          <w:color w:val="1F2937"/>
+          <w:sz w:val="21"/>
+        </w:rPr>
+        <w:t>Figure GD-07 — Project Markdown files under src/content/projects</w:t>
+      </w:r>
+    </w:p>
+    <w:p>
+      <w:pPr>
+        <w:spacing w:after="120" w:line="269" w:lineRule="auto"/>
+      </w:pPr>
+      <w:r>
+        <w:rPr>
+          <w:rFonts w:ascii="Arial" w:hAnsi="Arial"/>
+          <w:i w:val="0"/>
+          <w:sz w:val="22"/>
+        </w:rPr>
+        <w:t>After editing and saving the correct files, return to GitHub Desktop and follow the commit and push sequence below.</w:t>
+      </w:r>
+    </w:p>
+    <w:p>
+      <w:r>
+        <w:br w:type="page"/>
+      </w:r>
+    </w:p>
+    <w:p>
+      <w:pPr>
+        <w:pStyle w:val="Heading2"/>
+        <w:keepNext/>
+      </w:pPr>
+      <w:r>
+        <w:t>After editing — commit and push</w:t>
       </w:r>
     </w:p>
     <w:p>
@@ -5747,7 +6438,7 @@
           <w:sz w:val="21"/>
           <w:szCs w:val="21"/>
         </w:rPr>
-        <w:t xml:space="preserve">Figure GD-01 — The update, commit, and push order in GitHub Desktop</w:t>
+        <w:t>Figure GD-08 — The update, commit, and push order in GitHub Desktop</w:t>
       </w:r>
     </w:p>
     <w:p>

</xml_diff>